<commit_message>
fix: accept CRLF parts fixtures and diversify layouts
Co-Authored-By: Paperclip <noreply@paperclip.ing>
</commit_message>
<xml_diff>
--- a/docs/testing/parts-import-fixtures/docx/parts-import-word-style-03.docx
+++ b/docs/testing/parts-import-fixtures/docx/parts-import-word-style-03.docx
@@ -9,187 +9,187 @@
     </w:p>
     <w:p>
       <w:r>
-        <w:t>Word fixture style 3; user must verify supplier/category/duplicates before import.</w:t>
+        <w:t>Layout tabbed-counter-export; verify supplier/category/duplicates before import.</w:t>
       </w:r>
     </w:p>
     <w:p>
       <w:r>
-        <w:t>Code | Name | Category | Brand | Cost | Unit | Qty</w:t>
+        <w:t>Code	Name	Brand	Category	Unit	Qty	Cost</w:t>
       </w:r>
     </w:p>
     <w:p>
       <w:r>
-        <w:t>F-42-001 | EMT Set-Screw Connector #7 | Fittings | Bridgeport | 2.06 | ea | 43</w:t>
+        <w:t xml:space="preserve">F-42-001	EMT Set-Screw Connector #7	Bridgeport	Fittings	ea	43	2.06</w:t>
       </w:r>
     </w:p>
     <w:p>
       <w:r>
-        <w:t>B-42-002 | 40A 1-pole QO Plug-On Breaker | Breakers | Square D | 21.12 | ea | 46</w:t>
+        <w:t xml:space="preserve">B-42-002	40A 1-pole QO Plug-On Breaker	Square D	Breakers	ea	46	21.12</w:t>
       </w:r>
     </w:p>
     <w:p>
       <w:r>
-        <w:t>B-42-003 | Steel Device Box #9 | Boxes | Raco | 4.72 | ea | 1</w:t>
+        <w:t xml:space="preserve">B-42-003	Steel Device Box #9	Raco	Boxes	ea	1	4.72</w:t>
       </w:r>
     </w:p>
     <w:p>
       <w:r>
-        <w:t>L-42-004 | LED Flat Panel #10 | Lighting | Lithonia | 48.60 | ea | 4</w:t>
+        <w:t xml:space="preserve">L-42-004	LED Flat Panel #10	Lithonia	Lighting	ea	4	48.60</w:t>
       </w:r>
     </w:p>
     <w:p>
       <w:r>
-        <w:t>D-42-005 | Decorator Receptacle #11 | Devices | Leviton | 3.49 | ea | 7</w:t>
+        <w:t xml:space="preserve">D-42-005	Decorator Receptacle #11	Leviton	Devices	ea	7	3.49</w:t>
       </w:r>
     </w:p>
     <w:p>
       <w:r>
-        <w:t>F-42-006 | Strut Strap #12 | Fasteners | Minerallac | 0.71 | ea | 10</w:t>
+        <w:t xml:space="preserve">F-42-006	Strut Strap #12	Minerallac	Fasteners	ea	10	0.71</w:t>
       </w:r>
     </w:p>
     <w:p>
       <w:r>
-        <w:t>W-42-007 | 8 AWG THHN Copper Wire 250 ft spool | Wire | Southwire | 0.22 | ft | 13</w:t>
+        <w:t xml:space="preserve">W-42-007	8 AWG THHN Copper Wire 250 ft spool	Southwire	Wire	ft	13	0.22</w:t>
       </w:r>
     </w:p>
     <w:p>
       <w:r>
-        <w:t>C-42-008 | 2 in EMT Conduit 10 ft | Conduit | Allied Tube | 8.78 | stick | 16</w:t>
+        <w:t xml:space="preserve">C-42-008	2 in EMT Conduit 10 ft	Allied Tube	Conduit	stick	16	8.78</w:t>
       </w:r>
     </w:p>
     <w:p>
       <w:r>
-        <w:t>F-42-009 | EMT Set-Screw Connector #3 | Fittings | Bridgeport | 1.95 | ea | 19</w:t>
+        <w:t xml:space="preserve">F-42-009	EMT Set-Screw Connector #3	Bridgeport	Fittings	ea	19	1.95</w:t>
       </w:r>
     </w:p>
     <w:p>
       <w:r>
-        <w:t>B-42-010 | 20A 1-pole QO Plug-On Breaker | Breakers | Square D | 20.08 | ea | 22</w:t>
+        <w:t xml:space="preserve">B-42-010	20A 1-pole QO Plug-On Breaker	Square D	Breakers	ea	22	20.08</w:t>
       </w:r>
     </w:p>
     <w:p>
       <w:r>
-        <w:t>B-42-011 | Steel Device Box #5 | Boxes | Raco | 4.50 | ea | 25</w:t>
+        <w:t xml:space="preserve">B-42-011	Steel Device Box #5	Raco	Boxes	ea	25	4.50</w:t>
       </w:r>
     </w:p>
     <w:p>
       <w:r>
-        <w:t>L-42-012 | LED Flat Panel #6 | Lighting | Lithonia | 77.76 | ea | 28</w:t>
+        <w:t xml:space="preserve">L-42-012	LED Flat Panel #6	Lithonia	Lighting	ea	28	77.76</w:t>
       </w:r>
     </w:p>
     <w:p>
       <w:r>
-        <w:t>D-42-013 | Decorator Receptacle #7 | Devices | Leviton | 3.25 | ea | 31</w:t>
+        <w:t xml:space="preserve">D-42-013	Decorator Receptacle #7	Leviton	Devices	ea	31	3.25</w:t>
       </w:r>
     </w:p>
     <w:p>
       <w:r>
-        <w:t>F-42-014 | Strut Strap #8 | Fasteners | Minerallac | 0.67 | ea | 34</w:t>
+        <w:t xml:space="preserve">F-42-014	Strut Strap #8	Minerallac	Fasteners	ea	34	0.67</w:t>
       </w:r>
     </w:p>
     <w:p>
       <w:r>
-        <w:t>W-42-015 | 12 AWG THHN Copper Wire 250 ft spool | Wire | Southwire | 0.21 | ft | 37</w:t>
+        <w:t xml:space="preserve">W-42-015	12 AWG THHN Copper Wire 250 ft spool	Southwire	Wire	ft	37	0.21</w:t>
       </w:r>
     </w:p>
     <w:p>
       <w:r>
-        <w:t>C-42-016 | 1 in EMT Conduit 10 ft | Conduit | Allied Tube | 8.27 | stick | 40</w:t>
+        <w:t xml:space="preserve">C-42-016	1 in EMT Conduit 10 ft	Allied Tube	Conduit	stick	40	8.27</w:t>
       </w:r>
     </w:p>
     <w:p>
       <w:r>
-        <w:t>F-42-017 | EMT Set-Screw Connector #11 | Fittings | Bridgeport | 1.85 | ea | 43</w:t>
+        <w:t xml:space="preserve">F-42-017	EMT Set-Screw Connector #11	Bridgeport	Fittings	ea	43	1.85</w:t>
       </w:r>
     </w:p>
     <w:p>
       <w:r>
-        <w:t>B-42-018 | 50A 1-pole QO Plug-On Breaker | Breakers | Square D | 19.04 | ea | 46</w:t>
+        <w:t xml:space="preserve">B-42-018	50A 1-pole QO Plug-On Breaker	Square D	Breakers	ea	46	19.04</w:t>
       </w:r>
     </w:p>
     <w:p>
       <w:r>
-        <w:t>B-42-019 | Steel Device Box #1 | Boxes | Raco | 4.28 | ea | 1</w:t>
+        <w:t xml:space="preserve">B-42-019	Steel Device Box #1	Raco	Boxes	ea	1	4.28</w:t>
       </w:r>
     </w:p>
     <w:p>
       <w:r>
-        <w:t>L-42-020 | LED Flat Panel #2 | Lighting | Lithonia | 74.11 | ea | 4</w:t>
+        <w:t xml:space="preserve">L-42-020	LED Flat Panel #2	Lithonia	Lighting	ea	4	74.11</w:t>
       </w:r>
     </w:p>
     <w:p>
       <w:r>
-        <w:t>D-42-021 | Decorator Receptacle #3 | Devices | Leviton | 5.20 | ea | 7</w:t>
+        <w:t xml:space="preserve">D-42-021	Decorator Receptacle #3	Leviton	Devices	ea	7	5.20</w:t>
       </w:r>
     </w:p>
     <w:p>
       <w:r>
-        <w:t>F-42-022 | Strut Strap #4 | Fasteners | Minerallac | 0.62 | ea | 10</w:t>
+        <w:t xml:space="preserve">F-42-022	Strut Strap #4	Minerallac	Fasteners	ea	10	0.62</w:t>
       </w:r>
     </w:p>
     <w:p>
       <w:r>
-        <w:t>W-42-023 | 6 AWG THHN Copper Wire 250 ft spool | Wire | Southwire | 0.19 | ft | 13</w:t>
+        <w:t xml:space="preserve">W-42-023	6 AWG THHN Copper Wire 250 ft spool	Southwire	Wire	ft	13	0.19</w:t>
       </w:r>
     </w:p>
     <w:p>
       <w:r>
-        <w:t>C-42-024 | 1/2 in EMT Conduit 10 ft | Conduit | Allied Tube | 7.76 | stick | 16</w:t>
+        <w:t xml:space="preserve">C-42-024	1/2 in EMT Conduit 10 ft	Allied Tube	Conduit	stick	16	7.76</w:t>
       </w:r>
     </w:p>
     <w:p>
       <w:r>
-        <w:t>F-42-025 | EMT Set-Screw Connector #7 | Fittings | Bridgeport | 1.74 | ea | 19</w:t>
+        <w:t xml:space="preserve">F-42-025	EMT Set-Screw Connector #7	Bridgeport	Fittings	ea	19	1.74</w:t>
       </w:r>
     </w:p>
     <w:p>
       <w:r>
-        <w:t>B-42-026 | 30A 1-pole QO Plug-On Breaker | Breakers | Square D | 18.00 | ea | 22</w:t>
+        <w:t xml:space="preserve">B-42-026	30A 1-pole QO Plug-On Breaker	Square D	Breakers	ea	22	18.00</w:t>
       </w:r>
     </w:p>
     <w:p>
       <w:r>
-        <w:t>B-42-027 | Steel Device Box #9 | Boxes | Raco | 4.06 | ea | 25</w:t>
+        <w:t xml:space="preserve">B-42-027	Steel Device Box #9	Raco	Boxes	ea	25	4.06</w:t>
       </w:r>
     </w:p>
     <w:p>
       <w:r>
-        <w:t>L-42-028 | LED Flat Panel #10 | Lighting | Lithonia | 70.47 | ea | 28</w:t>
+        <w:t xml:space="preserve">L-42-028	LED Flat Panel #10	Lithonia	Lighting	ea	28	70.47</w:t>
       </w:r>
     </w:p>
     <w:p>
       <w:r>
-        <w:t>D-42-029 | Decorator Receptacle #11 | Devices | Leviton | 4.96 | ea | 31</w:t>
+        <w:t xml:space="preserve">D-42-029	Decorator Receptacle #11	Leviton	Devices	ea	31	4.96</w:t>
       </w:r>
     </w:p>
     <w:p>
       <w:r>
-        <w:t>F-42-030 | Strut Strap #12 | Fasteners | Minerallac | 0.99 | ea | 34</w:t>
+        <w:t xml:space="preserve">F-42-030	Strut Strap #12	Minerallac	Fasteners	ea	34	0.99</w:t>
       </w:r>
     </w:p>
     <w:p>
       <w:r>
-        <w:t>W-42-031 | 10 AWG THHN Copper Wire 250 ft spool | Wire | Southwire | 0.18 | ft | 37</w:t>
+        <w:t xml:space="preserve">W-42-031	10 AWG THHN Copper Wire 250 ft spool	Southwire	Wire	ft	37	0.18</w:t>
       </w:r>
     </w:p>
     <w:p>
       <w:r>
-        <w:t>C-42-032 | 1-1/4 in EMT Conduit 10 ft | Conduit | Allied Tube | 7.26 | stick | 40</w:t>
+        <w:t xml:space="preserve">C-42-032	1-1/4 in EMT Conduit 10 ft	Allied Tube	Conduit	stick	40	7.26</w:t>
       </w:r>
     </w:p>
     <w:p>
       <w:r>
-        <w:t>F-42-033 | EMT Set-Screw Connector #3 | Fittings | Bridgeport | 1.63 | ea | 43</w:t>
+        <w:t xml:space="preserve">F-42-033	EMT Set-Screw Connector #3	Bridgeport	Fittings	ea	43	1.63</w:t>
       </w:r>
     </w:p>
     <w:p>
       <w:r>
-        <w:t>B-42-034 | 15A 1-pole QO Plug-On Breaker | Breakers | Square D | 16.97 | ea | 46</w:t>
+        <w:t xml:space="preserve">B-42-034	15A 1-pole QO Plug-On Breaker	Square D	Breakers	ea	46	16.97</w:t>
       </w:r>
     </w:p>
     <w:p>
       <w:r>
-        <w:t>B-42-035 | Steel Device Box #5 | Boxes | Raco | 3.84 | ea | 1</w:t>
+        <w:t xml:space="preserve">B-42-035	Steel Device Box #5	Raco	Boxes	ea	1	3.84</w:t>
       </w:r>
     </w:p>
     <w:sectPr/>

</xml_diff>